<commit_message>
log 分析支援 MikroTik RouterOS log，更新使用說明
</commit_message>
<xml_diff>
--- a/docs/log-analyzer-guide.docx
+++ b/docs/log-analyzer-guide.docx
@@ -972,6 +972,14 @@
     </w:p>
     <w:p>
       <w:pPr>
+        <w:pStyle w:val="ListBullet"/>
+      </w:pPr>
+      <w:r>
+        <w:t>支援 MikroTik RouterOS log：遠端 syslog（含或不含時間與主機名）與設備上 /log print 的匯出內容皆可直接貼上分析。防火牆 log 會拆出來源／目的 IP、埠、協定與進出介面，登入記錄會拆出帳號、來源 IP 與登入方式，可用於掃描偵測、依帳號／IP 檢視與去識別化。只有時間沒有日期的記錄以分析當天日期補上。</w:t>
+      </w:r>
+    </w:p>
+    <w:p>
+      <w:pPr>
         <w:pStyle w:val="Heading1"/>
       </w:pPr>
       <w:r>

</xml_diff>

<commit_message>
log 分析：FortiGate syslog、ASA／FTD 變體、PAN-OS GlobalProtect／User-ID、Juniper IDP／UTM、Check Point Log Exporter、Cisco Umbrella、Cisco Secure Endpoint
</commit_message>
<xml_diff>
--- a/docs/log-analyzer-guide.docx
+++ b/docs/log-analyzer-guide.docx
@@ -1204,6 +1204,70 @@
     </w:p>
     <w:p>
       <w:pPr>
+        <w:pStyle w:val="ListBullet"/>
+      </w:pPr>
+      <w:r>
+        <w:t>FortiGate log 可帶 syslog 優先權前綴（&lt;189&gt;date=…）或 devname 開頭；msg／使用者介面欄位中的帳號去識別化時一併換成假帳號。</w:t>
+      </w:r>
+    </w:p>
+    <w:p>
+      <w:pPr>
+        <w:pStyle w:val="ListBullet"/>
+      </w:pPr>
+      <w:r>
+        <w:t>Cisco ASA／FTD：日期可省略年份、帶時區，表頭可含主機名稱與程式名稱，%FTD-類別-等級-訊息號 格式也能解析。</w:t>
+      </w:r>
+    </w:p>
+    <w:p>
+      <w:pPr>
+        <w:pStyle w:val="ListBullet"/>
+      </w:pPr>
+      <w:r>
+        <w:t>Palo Alto PAN-OS：支援短表頭 syslog、RFC6587 長度前綴與無外殼 CSV；GLOBALPROTECT（登入失敗歸認證失敗）、USERID、HIPMATCH 拆出使用者、位址與裝置名稱。</w:t>
+      </w:r>
+    </w:p>
+    <w:p>
+      <w:pPr>
+        <w:pStyle w:val="ListBullet"/>
+      </w:pPr>
+      <w:r>
+        <w:t>Juniper SRX 的 IDP／IDS／UTM／進階防惡意程式／安全情資 log 拆出連線欄位；IDP 與 IDS 告警彙整成「入侵偵測／端點防護告警」問題。</w:t>
+      </w:r>
+    </w:p>
+    <w:p>
+      <w:pPr>
+        <w:pStyle w:val="ListBullet"/>
+      </w:pPr>
+      <w:r>
+        <w:t>Check Point Log Exporter（RFC5424 結構化欄位）：拆出來源、目的、服務、動作與規則名稱，拒絕歸為阻擋並可送防火牆反查。</w:t>
+      </w:r>
+    </w:p>
+    <w:p>
+      <w:pPr>
+        <w:pStyle w:val="ListBullet"/>
+      </w:pPr>
+      <w:r>
+        <w:t>Cisco Umbrella CSV（DNS／IP／Proxy／Cloud Firewall）：依欄位形狀自動判斷類型，被阻擋的請求歸為阻擋類。</w:t>
+      </w:r>
+    </w:p>
+    <w:p>
+      <w:pPr>
+        <w:pStyle w:val="ListBullet"/>
+      </w:pPr>
+      <w:r>
+        <w:t>Cisco Secure Endpoint（AMP）事件 JSON（API 回應或逐行事件）：威脅偵測、隔離與雲端 IOC 歸為攻擊，依偵測名稱彙整；去識別化會遮蔽電腦名稱、位址、MAC 與路徑中的帳號。</w:t>
+      </w:r>
+    </w:p>
+    <w:p>
+      <w:pPr>
+        <w:pStyle w:val="ListBullet"/>
+      </w:pPr>
+      <w:r>
+        <w:t>入口頁拖放可辨識以上格式並導向 log 分析工具。</w:t>
+      </w:r>
+    </w:p>
+    <w:p>
+      <w:pPr>
         <w:pStyle w:val="Heading1"/>
       </w:pPr>
       <w:r>

</xml_diff>

<commit_message>
Round 19: Cisco IOS routed interface IPs, threat-intel import for OTX/URLhaus/MISP/ThreatQ/STIX 2, file-hash matching for endpoint and Zeek logs, JSON messages inside syslog, log analyzer vendor list with persona eggs on the hub
</commit_message>
<xml_diff>
--- a/docs/log-analyzer-guide.docx
+++ b/docs/log-analyzer-guide.docx
@@ -1348,6 +1348,30 @@
     </w:p>
     <w:p>
       <w:pPr>
+        <w:pStyle w:val="ListBullet"/>
+      </w:pPr>
+      <w:r>
+        <w:t>威脅情資匯入可直接使用 OTX、abuse.ch URLhaus、MISP（含 Object 與複合型別）、ThreatQ、STIX 2 indicator 的匯出檔；URL 會取出主機名稱比對，一筆情資可帶出多個位址、網域或雜湊。</w:t>
+      </w:r>
+    </w:p>
+    <w:p>
+      <w:pPr>
+        <w:pStyle w:val="ListBullet"/>
+      </w:pPr>
+      <w:r>
+        <w:t>雜湊情資：MalwareBazaar、abuse.ch、OTX、MISP、STIX 2 的檔案雜湊可匯入雜湊清單；除 Sysmon 外，Cisco Secure Endpoint、CrowdStrike Falcon、Microsoft Defender 與 Zeek files.log 的檔案雜湊也會比對，命中列為「已知惡意檔案雜湊」。</w:t>
+      </w:r>
+    </w:p>
+    <w:p>
+      <w:pPr>
+        <w:pStyle w:val="ListBullet"/>
+      </w:pPr>
+      <w:r>
+        <w:t>Syslog 訊息本體為 JSON（含 rsyslog @cee: 前綴、CyberArk Vault 稽核記錄）時會拆出來源／目的位址、埠、帳號與動作，可用於分類、防火牆反查與去識別化。</w:t>
+      </w:r>
+    </w:p>
+    <w:p>
+      <w:pPr>
         <w:pStyle w:val="Heading1"/>
       </w:pPr>
       <w:r>

</xml_diff>

<commit_message>
Round 20: netfilter prefix fix, Cisco ASA authentication messages, Palo Alto threat details and IDS alerts, ASA/PAN-OS/cloud firewall config changes, AWS S3 access logs, Azure Activity Log and GCP Cloud Audit Logs
</commit_message>
<xml_diff>
--- a/docs/log-analyzer-guide.docx
+++ b/docs/log-analyzer-guide.docx
@@ -1372,6 +1372,54 @@
     </w:p>
     <w:p>
       <w:pPr>
+        <w:pStyle w:val="ListBullet"/>
+      </w:pPr>
+      <w:r>
+        <w:t>Linux iptables／nftables 記錄前綴以底線連字（如 DROP_INPUT、FW_BLOCK）也能判斷為拒絕或允許。</w:t>
+      </w:r>
+    </w:p>
+    <w:p>
+      <w:pPr>
+        <w:pStyle w:val="ListBullet"/>
+      </w:pPr>
+      <w:r>
+        <w:t>Cisco ASA／FTD 的管理登入被拒、VPN 認證被拒、AAA 認證失敗等訊息歸為認證失敗，並拆出帳號與來源位址，可依帳號或來源統計失敗次數。</w:t>
+      </w:r>
+    </w:p>
+    <w:p>
+      <w:pPr>
+        <w:pStyle w:val="ListBullet"/>
+      </w:pPr>
+      <w:r>
+        <w:t>Palo Alto 威脅紀錄拆出威脅名稱、編號、類別、嚴重度與 URL；病毒、間諜軟體、弱點攻擊、WildFire 依威脅編號彙整成入侵告警。</w:t>
+      </w:r>
+    </w:p>
+    <w:p>
+      <w:pPr>
+        <w:pStyle w:val="ListBullet"/>
+      </w:pPr>
+      <w:r>
+        <w:t>設定變更另外涵蓋 Cisco ASA／FTD 的指令紀錄（略過 show 等唯讀指令）、Palo Alto CONFIG 紀錄，以及 AWS 安全群組／Network ACL、Azure NSG 與防火牆、GCP 防火牆規則的變更。</w:t>
+      </w:r>
+    </w:p>
+    <w:p>
+      <w:pPr>
+        <w:pStyle w:val="ListBullet"/>
+      </w:pPr>
+      <w:r>
+        <w:t>支援 AWS S3 伺服器存取紀錄（403 AccessDenied 列為遭拒），去識別化會替換擁有者 ID、儲存貯體、帳號 ID 與 IAM 使用者。</w:t>
+      </w:r>
+    </w:p>
+    <w:p>
+      <w:pPr>
+        <w:pStyle w:val="ListBullet"/>
+      </w:pPr>
+      <w:r>
+        <w:t>支援 Azure Activity Log 與 GCP Cloud Audit Logs：拆出操作、帳號與來源位址，角色指派、IAM 政策、服務帳號金鑰、刪除診斷設定或記錄匯出等高風險操作列入問題清單。</w:t>
+      </w:r>
+    </w:p>
+    <w:p>
+      <w:pPr>
         <w:pStyle w:val="Heading1"/>
       </w:pPr>
       <w:r>

</xml_diff>

<commit_message>
Fix missing translations, localize log issue summaries, add new easter eggs
</commit_message>
<xml_diff>
--- a/docs/log-analyzer-guide.docx
+++ b/docs/log-analyzer-guide.docx
@@ -1516,6 +1516,14 @@
     </w:p>
     <w:p>
       <w:pPr>
+        <w:pStyle w:val="ListBullet"/>
+      </w:pPr>
+      <w:r>
+        <w:t>問題清單摘要依介面語言顯示：SSH 暴力破解後成功、設定變更、DNS 異常、Web 路徑探測、掃描、週期性連線、橫向移動與異地登入的摘要切換英文或日文時一併翻譯，報表與 CSV 同步。</w:t>
+      </w:r>
+    </w:p>
+    <w:p>
+      <w:pPr>
         <w:pStyle w:val="Heading1"/>
       </w:pPr>
       <w:r>

</xml_diff>

<commit_message>
log：FreeRADIUS detail／radius.log 異常、OpenLDAP slapd 與 389 DS、Windows Winlogbeat／NXLog／CSV 與 AD 偵測
Co-Authored-By: Claude Opus 5.5 <noreply@anthropic.com>
Claude-Session: https://claude.ai/code/session_01D2xU2edPrDJu3FCYwjpFU7
</commit_message>
<xml_diff>
--- a/docs/log-analyzer-guide.docx
+++ b/docs/log-analyzer-guide.docx
@@ -1604,6 +1604,70 @@
     </w:p>
     <w:p>
       <w:pPr>
+        <w:pStyle w:val="ListBullet"/>
+      </w:pPr>
+      <w:r>
+        <w:t>（2026-10 第三十輪）Windows 事件新增 Winlogbeat／Elastic Agent 與 NXLog 的 JSON、事件檢視器「另存所有事件」CSV 與 PowerShell Export-Csv，轉成與 XML 相同的事件，原有 Windows 偵測都適用；去識別化後一律輸出 XML。</w:t>
+      </w:r>
+    </w:p>
+    <w:p>
+      <w:pPr>
+        <w:pStyle w:val="ListBullet"/>
+      </w:pPr>
+      <w:r>
+        <w:t>Windows 登入失敗原因：4625／4776 的 NTSTATUS 與 4768／4771 的 Kerberos 錯誤碼轉成文字（密碼錯誤、帳號不存在、已鎖定…），問題清單「Windows 登入失敗原因」依原因統計；帳號不存在的帳號達 5 個時升為 Medium。</w:t>
+      </w:r>
+    </w:p>
+    <w:p>
+      <w:pPr>
+        <w:pStyle w:val="ListBullet"/>
+      </w:pPr>
+      <w:r>
+        <w:t>密碼噴灑：同一來源 1 小時內對 5 個以上帳號認證失敗、平均每帳號不超過 3 次即列出，適用 Windows、LDAP、RADIUS、SSH、VPN 與雲端登入等所有認證失敗事件。</w:t>
+      </w:r>
+    </w:p>
+    <w:p>
+      <w:pPr>
+        <w:pStyle w:val="ListBullet"/>
+      </w:pPr>
+      <w:r>
+        <w:t>遠端桌面與登入類型：讀取 1149 與 LocalSessionManager 21～25 的帳號與來源、4624 類型 10，依來源列出遠端桌面登入（來源為公用位址時為 Medium）；LogonType 8 列「明碼網路登入」。</w:t>
+      </w:r>
+    </w:p>
+    <w:p>
+      <w:pPr>
+        <w:pStyle w:val="ListBullet"/>
+      </w:pPr>
+      <w:r>
+        <w:t>AD 高風險異動：5136 的使用者物件 SPN、資源型委派、Shadow Credentials、gPLink、AdminSDHolder 與授予目錄複寫權限；4742 的 SPN／委派變更、4765／4766 SID History、4794 DSRM 密碼、4741 電腦帳號建立、4887 憑證核發（要求自帶 SAN 時為 High）。需在網域控制站開啟對應稽核。</w:t>
+      </w:r>
+    </w:p>
+    <w:p>
+      <w:pPr>
+        <w:pStyle w:val="ListBullet"/>
+      </w:pPr>
+      <w:r>
+        <w:t>DCSync：4662 含目錄複寫權限 GUID、AccessMask 0x100 且操作者不是電腦帳號、MSOL_ 同步帳號或系統帳號時列為 Critical（條件依 SigmaHQ 與 Elastic 偵測規則）。</w:t>
+      </w:r>
+    </w:p>
+    <w:p>
+      <w:pPr>
+        <w:pStyle w:val="ListBullet"/>
+      </w:pPr>
+      <w:r>
+        <w:t>LDAP：OpenLDAP slapd（syslog）與 389 Directory Server access log，依連線串回來源位址與帳號；偵測繫結暴力破解（之後成功為 High）、未加密連線上的明碼繫結、匿名繫結與目錄大量查詢；網域控制站 2889 列出未簽章與明碼繫結的用戶端。去識別化會替換 DN 與搜尋條件中的帳號與網域。</w:t>
+      </w:r>
+    </w:p>
+    <w:p>
+      <w:pPr>
+        <w:pStyle w:val="ListBullet"/>
+      </w:pPr>
+      <w:r>
+        <w:t>FreeRADIUS：radacct detail 計費紀錄（Start／Interim／Stop，可與其他 log 一起上傳，指派位址可對照帳號）；radius.log 另外辨識未登記設備、共用密鑰不符、EAP TLS 失敗與同一終端多帳號認證。Windows NPS 的 log 格式因欄位順序查無可信來源，仍未支援。</w:t>
+      </w:r>
+    </w:p>
+    <w:p>
+      <w:pPr>
         <w:pStyle w:val="Heading1"/>
       </w:pPr>
       <w:r>

</xml_diff>